<commit_message>
DEVELOPMENT BASELINE for CRM work (release gate and Ryzen cutover PENDING)
Sanitised source of AgenticOS-v4 branch ryzen/migration-20261002 at
317c5e6a90912632395ee89d42b7c03de2edfefc (code identical to 995c0a40, the candidate under the
final release gate). Built with scripts/cloud/release-package.ts: git archive of that commit minus
the deny list; secret scan 0 hits in shipped code.
Tarball sha256 2efe5fb76cc88d7957519543e57dbedde2e2c6cb4ba99b3849d078bacbdf3358.
Manifest and SHA256SUMS in HANDOFF-PACKAGE/. Read docs/programme-20261001/DOT-CRM-HANDOFF.md,
AGENTS-WORKSPACE-OWNERSHIP.md and AGENTS-CRM-CONTRACTS.md first.

This commit replaces the tree of main (3a8d304) with the baseline; main and
cloud/agenticos-next-integration-20260929 are unchanged.

Co-Authored-By: Claude Opus 5.5 <noreply@anthropic.com>
</commit_message>
<xml_diff>
--- a/docs/sales/receptionist-pack-2026-09-28/proposal-template.docx
+++ b/docs/sales/receptionist-pack-2026-09-28/proposal-template.docx
@@ -121,7 +121,7 @@
     <w:p>
       <w:pPr>
         <w:shd w:val="clear" w:color="auto" w:fill="FFFBEB"/>
-        <w:divId w:val="809980277"/>
+        <w:divId w:val="1375274531"/>
         <w:rPr>
           <w:rFonts w:ascii="Calibri" w:eastAsia="Times New Roman" w:hAnsi="Calibri" w:cs="Calibri"/>
           <w:color w:val="14213D"/>
@@ -224,7 +224,7 @@
     <w:p>
       <w:pPr>
         <w:shd w:val="clear" w:color="auto" w:fill="CCFBF1"/>
-        <w:divId w:val="411436993"/>
+        <w:divId w:val="1714424651"/>
         <w:rPr>
           <w:rFonts w:ascii="Calibri" w:eastAsia="Times New Roman" w:hAnsi="Calibri" w:cs="Calibri"/>
           <w:color w:val="14213D"/>
@@ -297,26 +297,7 @@
           <w:sz w:val="21"/>
           <w:szCs w:val="21"/>
         </w:rPr>
-        <w:t xml:space="preserve">, in the cover you choose (Essential includes: after hours, when busy / no answer </w:t>
-      </w:r>
-      <w:r>
-        <w:rPr>
-          <w:rStyle w:val="fill1"/>
-          <w:rFonts w:ascii="Calibri" w:hAnsi="Calibri" w:cs="Calibri"/>
-          <w:color w:val="14213D"/>
-          <w:sz w:val="21"/>
-          <w:szCs w:val="21"/>
-        </w:rPr>
-        <w:t>[OWNER DECISION (a) PENDING: is Essential cover after hours and busy / no answer only, or business hours alongside the team too? Not decided.]</w:t>
-      </w:r>
-      <w:r>
-        <w:rPr>
-          <w:rFonts w:ascii="Calibri" w:hAnsi="Calibri" w:cs="Calibri"/>
-          <w:color w:val="14213D"/>
-          <w:sz w:val="21"/>
-          <w:szCs w:val="21"/>
-        </w:rPr>
-        <w:t>). It tells every caller it is an automated assistant and that the call is recorded. At go-live, in Booked mode, it books into a connected Google Calendar or Cal.com calendar, reads back a reference and texts the caller a confirmation if they agree; in Booking request mode it takes a booking request instead. Anything urgent gets the 000 line first, then an urgent message to your team.</w:t>
+        <w:t>, in the cover you choose (Essential includes: after hours, when busy / no answer, all calls). It tells every caller it is an automated assistant and that the call is recorded. At go-live, in Booked mode, it books into a connected Google Calendar or Cal.com calendar, reads back a reference and texts the caller a confirmation if they agree; in Booking request mode it takes a booking request instead. Anything urgent gets the 000 line first, then an urgent message to your team.</w:t>
       </w:r>
     </w:p>
     <w:tbl>
@@ -469,17 +450,7 @@
                 <w:sz w:val="19"/>
                 <w:szCs w:val="19"/>
               </w:rPr>
-              <w:t xml:space="preserve">Answers calls in the cover configured for each business; says it is automated and the call is recorded. </w:t>
-            </w:r>
-            <w:r>
-              <w:rPr>
-                <w:rStyle w:val="fill1"/>
-                <w:rFonts w:ascii="Calibri" w:eastAsia="Times New Roman" w:hAnsi="Calibri" w:cs="Calibri"/>
-                <w:color w:val="14213D"/>
-                <w:sz w:val="19"/>
-                <w:szCs w:val="19"/>
-              </w:rPr>
-              <w:t>[OWNER DECISION (a) PENDING: is Essential cover after hours and busy / no answer only, or business hours alongside the team too? Not decided.]</w:t>
+              <w:t>Answers calls in business hours, after hours, alongside your team or as overflow, as configured for each business; says it is automated and the call is recorded</w:t>
             </w:r>
           </w:p>
         </w:tc>
@@ -1755,17 +1726,7 @@
           <w:sz w:val="21"/>
           <w:szCs w:val="21"/>
         </w:rPr>
-        <w:t xml:space="preserve">Cover modes: After hours, When busy / no answer. </w:t>
-      </w:r>
-      <w:r>
-        <w:rPr>
-          <w:rStyle w:val="fill1"/>
-          <w:rFonts w:ascii="Calibri" w:eastAsia="Times New Roman" w:hAnsi="Calibri" w:cs="Calibri"/>
-          <w:color w:val="14213D"/>
-          <w:sz w:val="21"/>
-          <w:szCs w:val="21"/>
-        </w:rPr>
-        <w:t>[OWNER DECISION (a) PENDING: is Essential cover after hours and busy / no answer only, or business hours alongside the team too? Not decided.]</w:t>
+        <w:t>Cover modes: After hours, When busy / no answer, All calls.</w:t>
       </w:r>
     </w:p>
     <w:p>
@@ -3764,7 +3725,7 @@
     <w:p>
       <w:pPr>
         <w:shd w:val="clear" w:color="auto" w:fill="CCFBF1"/>
-        <w:divId w:val="1843663243"/>
+        <w:divId w:val="2142455630"/>
         <w:rPr>
           <w:rFonts w:ascii="Calibri" w:eastAsia="Times New Roman" w:hAnsi="Calibri" w:cs="Calibri"/>
           <w:color w:val="14213D"/>
@@ -7079,17 +7040,7 @@
                 <w:sz w:val="19"/>
                 <w:szCs w:val="19"/>
               </w:rPr>
-              <w:t xml:space="preserve">After hours; When busy / no answer </w:t>
-            </w:r>
-            <w:r>
-              <w:rPr>
-                <w:rStyle w:val="fill1"/>
-                <w:rFonts w:ascii="Calibri" w:eastAsia="Times New Roman" w:hAnsi="Calibri" w:cs="Calibri"/>
-                <w:color w:val="14213D"/>
-                <w:sz w:val="19"/>
-                <w:szCs w:val="19"/>
-              </w:rPr>
-              <w:t>[OWNER DECISION (a) PENDING: is Essential cover after hours and busy / no answer only, or business hours alongside the team too? Not decided.]</w:t>
+              <w:t>After hours; When busy / no answer; All calls</w:t>
             </w:r>
           </w:p>
         </w:tc>
@@ -7879,9 +7830,9 @@
 <file path=word/numbering.xml><?xml version="1.0" encoding="utf-8"?>
 <w:numbering xmlns:wpc="http://schemas.microsoft.com/office/word/2010/wordprocessingCanvas" xmlns:cx="http://schemas.microsoft.com/office/drawing/2014/chartex" xmlns:cx1="http://schemas.microsoft.com/office/drawing/2015/9/8/chartex" xmlns:cx2="http://schemas.microsoft.com/office/drawing/2015/10/21/chartex" xmlns:cx3="http://schemas.microsoft.com/office/drawing/2016/5/9/chartex" xmlns:cx4="http://schemas.microsoft.com/office/drawing/2016/5/10/chartex" xmlns:cx5="http://schemas.microsoft.com/office/drawing/2016/5/11/chartex" xmlns:cx6="http://schemas.microsoft.com/office/drawing/2016/5/12/chartex" xmlns:cx7="http://schemas.microsoft.com/office/drawing/2016/5/13/chartex" xmlns:cx8="http://schemas.microsoft.com/office/drawing/2016/5/14/chartex" xmlns:mc="http://schemas.openxmlformats.org/markup-compatibility/2006" xmlns:aink="http://schemas.microsoft.com/office/drawing/2016/ink" xmlns:am3d="http://schemas.microsoft.com/office/drawing/2017/model3d" xmlns:o="urn:schemas-microsoft-com:office:office" xmlns:oel="http://schemas.microsoft.com/office/2019/extlst" xmlns:r="http://schemas.openxmlformats.org/officeDocument/2006/relationships" xmlns:m="http://schemas.openxmlformats.org/officeDocument/2006/math" xmlns:v="urn:schemas-microsoft-com:vml" xmlns:wp14="http://schemas.microsoft.com/office/word/2010/wordprocessingDrawing" xmlns:wp="http://schemas.openxmlformats.org/drawingml/2006/wordprocessingDrawing" xmlns:w10="urn:schemas-microsoft-com:office:word" xmlns:w="http://schemas.openxmlformats.org/wordprocessingml/2006/main" xmlns:w14="http://schemas.microsoft.com/office/word/2010/wordml" xmlns:w15="http://schemas.microsoft.com/office/word/2012/wordml" xmlns:w16cex="http://schemas.microsoft.com/office/word/2018/wordml/cex" xmlns:w16cid="http://schemas.microsoft.com/office/word/2016/wordml/cid" xmlns:w16="http://schemas.microsoft.com/office/word/2018/wordml" xmlns:w16du="http://schemas.microsoft.com/office/word/2023/wordml/word16du" xmlns:w16sdtdh="http://schemas.microsoft.com/office/word/2020/wordml/sdtdatahash" xmlns:w16sdtfl="http://schemas.microsoft.com/office/word/2024/wordml/sdtformatlock" xmlns:w16se="http://schemas.microsoft.com/office/word/2015/wordml/symex" xmlns:wpg="http://schemas.microsoft.com/office/word/2010/wordprocessingGroup" xmlns:wpi="http://schemas.microsoft.com/office/word/2010/wordprocessingInk" xmlns:wne="http://schemas.microsoft.com/office/word/2006/wordml" xmlns:wps="http://schemas.microsoft.com/office/word/2010/wordprocessingShape" mc:Ignorable="w14 w15 w16se w16cid w16 w16cex w16sdtdh w16sdtfl w16du wp14">
   <w:abstractNum w:abstractNumId="0" w15:restartNumberingAfterBreak="0">
-    <w:nsid w:val="0C9979B2"/>
+    <w:nsid w:val="0FCE0572"/>
     <w:multiLevelType w:val="multilevel"/>
-    <w:tmpl w:val="C7E8C77E"/>
+    <w:tmpl w:val="07606B56"/>
     <w:lvl w:ilvl="0">
       <w:start w:val="1"/>
       <w:numFmt w:val="bullet"/>
@@ -8028,9 +7979,9 @@
     </w:lvl>
   </w:abstractNum>
   <w:abstractNum w:abstractNumId="1" w15:restartNumberingAfterBreak="0">
-    <w:nsid w:val="54323BC8"/>
+    <w:nsid w:val="229868DA"/>
     <w:multiLevelType w:val="multilevel"/>
-    <w:tmpl w:val="30D22F80"/>
+    <w:tmpl w:val="61403B04"/>
     <w:lvl w:ilvl="0">
       <w:start w:val="1"/>
       <w:numFmt w:val="bullet"/>
@@ -8177,9 +8128,9 @@
     </w:lvl>
   </w:abstractNum>
   <w:abstractNum w:abstractNumId="2" w15:restartNumberingAfterBreak="0">
-    <w:nsid w:val="5A960032"/>
+    <w:nsid w:val="575810E7"/>
     <w:multiLevelType w:val="multilevel"/>
-    <w:tmpl w:val="5050661C"/>
+    <w:tmpl w:val="605AD5B6"/>
     <w:lvl w:ilvl="0">
       <w:start w:val="1"/>
       <w:numFmt w:val="bullet"/>
@@ -8325,14 +8276,14 @@
       </w:rPr>
     </w:lvl>
   </w:abstractNum>
-  <w:num w:numId="1" w16cid:durableId="1899630211">
+  <w:num w:numId="1" w16cid:durableId="848177715">
+    <w:abstractNumId w:val="1"/>
+  </w:num>
+  <w:num w:numId="2" w16cid:durableId="766730176">
     <w:abstractNumId w:val="0"/>
   </w:num>
-  <w:num w:numId="2" w16cid:durableId="1406956954">
+  <w:num w:numId="3" w16cid:durableId="298729224">
     <w:abstractNumId w:val="2"/>
-  </w:num>
-  <w:num w:numId="3" w16cid:durableId="1468543424">
-    <w:abstractNumId w:val="1"/>
   </w:num>
 </w:numbering>
 </file>
@@ -8745,7 +8696,7 @@
     <w:link w:val="Heading1Char"/>
     <w:uiPriority w:val="9"/>
     <w:qFormat/>
-    <w:rsid w:val="00DC034F"/>
+    <w:rsid w:val="00FA73C7"/>
     <w:pPr>
       <w:keepNext/>
       <w:keepLines/>
@@ -8767,7 +8718,7 @@
     <w:uiPriority w:val="9"/>
     <w:unhideWhenUsed/>
     <w:qFormat/>
-    <w:rsid w:val="00DC034F"/>
+    <w:rsid w:val="00FA73C7"/>
     <w:pPr>
       <w:keepNext/>
       <w:keepLines/>
@@ -8790,7 +8741,7 @@
     <w:uiPriority w:val="9"/>
     <w:unhideWhenUsed/>
     <w:qFormat/>
-    <w:rsid w:val="00DC034F"/>
+    <w:rsid w:val="00FA73C7"/>
     <w:pPr>
       <w:keepNext/>
       <w:keepLines/>
@@ -8814,7 +8765,7 @@
     <w:semiHidden/>
     <w:unhideWhenUsed/>
     <w:qFormat/>
-    <w:rsid w:val="00DC034F"/>
+    <w:rsid w:val="00FA73C7"/>
     <w:pPr>
       <w:keepNext/>
       <w:keepLines/>
@@ -8825,7 +8776,7 @@
       <w:rFonts w:eastAsiaTheme="majorEastAsia" w:cstheme="majorBidi"/>
       <w:i/>
       <w:iCs/>
-      <w:color w:val="2F5496" w:themeColor="accent1" w:themeShade="BF"/>
+      <w:color w:val="0F4761" w:themeColor="accent1" w:themeShade="BF"/>
     </w:rPr>
   </w:style>
   <w:style w:type="paragraph" w:styleId="Heading5">
@@ -8837,7 +8788,7 @@
     <w:semiHidden/>
     <w:unhideWhenUsed/>
     <w:qFormat/>
-    <w:rsid w:val="00DC034F"/>
+    <w:rsid w:val="00FA73C7"/>
     <w:pPr>
       <w:keepNext/>
       <w:keepLines/>
@@ -8846,7 +8797,7 @@
     </w:pPr>
     <w:rPr>
       <w:rFonts w:eastAsiaTheme="majorEastAsia" w:cstheme="majorBidi"/>
-      <w:color w:val="2F5496" w:themeColor="accent1" w:themeShade="BF"/>
+      <w:color w:val="0F4761" w:themeColor="accent1" w:themeShade="BF"/>
     </w:rPr>
   </w:style>
   <w:style w:type="paragraph" w:styleId="Heading6">
@@ -8858,7 +8809,7 @@
     <w:semiHidden/>
     <w:unhideWhenUsed/>
     <w:qFormat/>
-    <w:rsid w:val="00DC034F"/>
+    <w:rsid w:val="00FA73C7"/>
     <w:pPr>
       <w:keepNext/>
       <w:keepLines/>
@@ -8881,7 +8832,7 @@
     <w:semiHidden/>
     <w:unhideWhenUsed/>
     <w:qFormat/>
-    <w:rsid w:val="00DC034F"/>
+    <w:rsid w:val="00FA73C7"/>
     <w:pPr>
       <w:keepNext/>
       <w:keepLines/>
@@ -8902,7 +8853,7 @@
     <w:semiHidden/>
     <w:unhideWhenUsed/>
     <w:qFormat/>
-    <w:rsid w:val="00DC034F"/>
+    <w:rsid w:val="00FA73C7"/>
     <w:pPr>
       <w:keepNext/>
       <w:keepLines/>
@@ -8925,7 +8876,7 @@
     <w:semiHidden/>
     <w:unhideWhenUsed/>
     <w:qFormat/>
-    <w:rsid w:val="00DC034F"/>
+    <w:rsid w:val="00FA73C7"/>
     <w:pPr>
       <w:keepNext/>
       <w:keepLines/>
@@ -8969,7 +8920,7 @@
     <w:basedOn w:val="DefaultParagraphFont"/>
     <w:link w:val="Heading1"/>
     <w:uiPriority w:val="9"/>
-    <w:rsid w:val="00DC034F"/>
+    <w:rsid w:val="00FA73C7"/>
     <w:rPr>
       <w:rFonts w:ascii="Cambria" w:eastAsiaTheme="majorEastAsia" w:hAnsi="Cambria" w:cstheme="majorBidi"/>
       <w:color w:val="14213D"/>
@@ -8982,7 +8933,7 @@
     <w:basedOn w:val="DefaultParagraphFont"/>
     <w:link w:val="Heading2"/>
     <w:uiPriority w:val="9"/>
-    <w:rsid w:val="00DC034F"/>
+    <w:rsid w:val="00FA73C7"/>
     <w:rPr>
       <w:rFonts w:ascii="Calibri" w:eastAsiaTheme="majorEastAsia" w:hAnsi="Calibri" w:cs="Calibri"/>
       <w:b/>
@@ -8996,7 +8947,7 @@
     <w:basedOn w:val="DefaultParagraphFont"/>
     <w:link w:val="Heading3"/>
     <w:uiPriority w:val="9"/>
-    <w:rsid w:val="00DC034F"/>
+    <w:rsid w:val="00FA73C7"/>
     <w:rPr>
       <w:rFonts w:ascii="Calibri" w:eastAsiaTheme="majorEastAsia" w:hAnsi="Calibri" w:cs="Calibri"/>
       <w:b/>
@@ -9011,12 +8962,12 @@
     <w:link w:val="Heading4"/>
     <w:uiPriority w:val="9"/>
     <w:semiHidden/>
-    <w:rsid w:val="00DC034F"/>
+    <w:rsid w:val="00FA73C7"/>
     <w:rPr>
       <w:rFonts w:eastAsiaTheme="majorEastAsia" w:cstheme="majorBidi"/>
       <w:i/>
       <w:iCs/>
-      <w:color w:val="2F5496" w:themeColor="accent1" w:themeShade="BF"/>
+      <w:color w:val="0F4761" w:themeColor="accent1" w:themeShade="BF"/>
     </w:rPr>
   </w:style>
   <w:style w:type="character" w:customStyle="1" w:styleId="Heading5Char">
@@ -9025,10 +8976,10 @@
     <w:link w:val="Heading5"/>
     <w:uiPriority w:val="9"/>
     <w:semiHidden/>
-    <w:rsid w:val="00DC034F"/>
+    <w:rsid w:val="00FA73C7"/>
     <w:rPr>
       <w:rFonts w:eastAsiaTheme="majorEastAsia" w:cstheme="majorBidi"/>
-      <w:color w:val="2F5496" w:themeColor="accent1" w:themeShade="BF"/>
+      <w:color w:val="0F4761" w:themeColor="accent1" w:themeShade="BF"/>
     </w:rPr>
   </w:style>
   <w:style w:type="character" w:customStyle="1" w:styleId="Heading6Char">
@@ -9037,7 +8988,7 @@
     <w:link w:val="Heading6"/>
     <w:uiPriority w:val="9"/>
     <w:semiHidden/>
-    <w:rsid w:val="00DC034F"/>
+    <w:rsid w:val="00FA73C7"/>
     <w:rPr>
       <w:rFonts w:eastAsiaTheme="majorEastAsia" w:cstheme="majorBidi"/>
       <w:i/>
@@ -9051,7 +9002,7 @@
     <w:link w:val="Heading7"/>
     <w:uiPriority w:val="9"/>
     <w:semiHidden/>
-    <w:rsid w:val="00DC034F"/>
+    <w:rsid w:val="00FA73C7"/>
     <w:rPr>
       <w:rFonts w:eastAsiaTheme="majorEastAsia" w:cstheme="majorBidi"/>
       <w:color w:val="595959" w:themeColor="text1" w:themeTint="A6"/>
@@ -9063,7 +9014,7 @@
     <w:link w:val="Heading8"/>
     <w:uiPriority w:val="9"/>
     <w:semiHidden/>
-    <w:rsid w:val="00DC034F"/>
+    <w:rsid w:val="00FA73C7"/>
     <w:rPr>
       <w:rFonts w:eastAsiaTheme="majorEastAsia" w:cstheme="majorBidi"/>
       <w:i/>
@@ -9077,7 +9028,7 @@
     <w:link w:val="Heading9"/>
     <w:uiPriority w:val="9"/>
     <w:semiHidden/>
-    <w:rsid w:val="00DC034F"/>
+    <w:rsid w:val="00FA73C7"/>
     <w:rPr>
       <w:rFonts w:eastAsiaTheme="majorEastAsia" w:cstheme="majorBidi"/>
       <w:color w:val="272727" w:themeColor="text1" w:themeTint="D8"/>
@@ -9090,7 +9041,7 @@
     <w:link w:val="TitleChar"/>
     <w:uiPriority w:val="10"/>
     <w:qFormat/>
-    <w:rsid w:val="00DC034F"/>
+    <w:rsid w:val="00FA73C7"/>
     <w:pPr>
       <w:spacing w:after="80" w:line="240" w:lineRule="auto"/>
       <w:contextualSpacing/>
@@ -9108,7 +9059,7 @@
     <w:basedOn w:val="DefaultParagraphFont"/>
     <w:link w:val="Title"/>
     <w:uiPriority w:val="10"/>
-    <w:rsid w:val="00DC034F"/>
+    <w:rsid w:val="00FA73C7"/>
     <w:rPr>
       <w:rFonts w:asciiTheme="majorHAnsi" w:eastAsiaTheme="majorEastAsia" w:hAnsiTheme="majorHAnsi" w:cstheme="majorBidi"/>
       <w:spacing w:val="-10"/>
@@ -9124,7 +9075,7 @@
     <w:link w:val="SubtitleChar"/>
     <w:uiPriority w:val="11"/>
     <w:qFormat/>
-    <w:rsid w:val="00DC034F"/>
+    <w:rsid w:val="00FA73C7"/>
     <w:pPr>
       <w:numPr>
         <w:ilvl w:val="1"/>
@@ -9143,7 +9094,7 @@
     <w:basedOn w:val="DefaultParagraphFont"/>
     <w:link w:val="Subtitle"/>
     <w:uiPriority w:val="11"/>
-    <w:rsid w:val="00DC034F"/>
+    <w:rsid w:val="00FA73C7"/>
     <w:rPr>
       <w:rFonts w:eastAsiaTheme="majorEastAsia" w:cstheme="majorBidi"/>
       <w:color w:val="595959" w:themeColor="text1" w:themeTint="A6"/>
@@ -9159,7 +9110,7 @@
     <w:link w:val="QuoteChar"/>
     <w:uiPriority w:val="29"/>
     <w:qFormat/>
-    <w:rsid w:val="00DC034F"/>
+    <w:rsid w:val="00FA73C7"/>
     <w:pPr>
       <w:spacing w:before="160"/>
       <w:jc w:val="center"/>
@@ -9175,7 +9126,7 @@
     <w:basedOn w:val="DefaultParagraphFont"/>
     <w:link w:val="Quote"/>
     <w:uiPriority w:val="29"/>
-    <w:rsid w:val="00DC034F"/>
+    <w:rsid w:val="00FA73C7"/>
     <w:rPr>
       <w:i/>
       <w:iCs/>
@@ -9187,7 +9138,7 @@
     <w:basedOn w:val="Normal"/>
     <w:uiPriority w:val="34"/>
     <w:qFormat/>
-    <w:rsid w:val="00DC034F"/>
+    <w:rsid w:val="00FA73C7"/>
     <w:pPr>
       <w:ind w:left="720"/>
       <w:contextualSpacing/>
@@ -9198,11 +9149,11 @@
     <w:basedOn w:val="DefaultParagraphFont"/>
     <w:uiPriority w:val="21"/>
     <w:qFormat/>
-    <w:rsid w:val="00DC034F"/>
+    <w:rsid w:val="00FA73C7"/>
     <w:rPr>
       <w:i/>
       <w:iCs/>
-      <w:color w:val="2F5496" w:themeColor="accent1" w:themeShade="BF"/>
+      <w:color w:val="0F4761" w:themeColor="accent1" w:themeShade="BF"/>
     </w:rPr>
   </w:style>
   <w:style w:type="paragraph" w:styleId="IntenseQuote">
@@ -9212,11 +9163,11 @@
     <w:link w:val="IntenseQuoteChar"/>
     <w:uiPriority w:val="30"/>
     <w:qFormat/>
-    <w:rsid w:val="00DC034F"/>
+    <w:rsid w:val="00FA73C7"/>
     <w:pPr>
       <w:pBdr>
-        <w:top w:val="single" w:sz="4" w:space="10" w:color="2F5496" w:themeColor="accent1" w:themeShade="BF"/>
-        <w:bottom w:val="single" w:sz="4" w:space="10" w:color="2F5496" w:themeColor="accent1" w:themeShade="BF"/>
+        <w:top w:val="single" w:sz="4" w:space="10" w:color="0F4761" w:themeColor="accent1" w:themeShade="BF"/>
+        <w:bottom w:val="single" w:sz="4" w:space="10" w:color="0F4761" w:themeColor="accent1" w:themeShade="BF"/>
       </w:pBdr>
       <w:spacing w:before="360" w:after="360"/>
       <w:ind w:left="864" w:right="864"/>
@@ -9225,7 +9176,7 @@
     <w:rPr>
       <w:i/>
       <w:iCs/>
-      <w:color w:val="2F5496" w:themeColor="accent1" w:themeShade="BF"/>
+      <w:color w:val="0F4761" w:themeColor="accent1" w:themeShade="BF"/>
     </w:rPr>
   </w:style>
   <w:style w:type="character" w:customStyle="1" w:styleId="IntenseQuoteChar">
@@ -9233,11 +9184,11 @@
     <w:basedOn w:val="DefaultParagraphFont"/>
     <w:link w:val="IntenseQuote"/>
     <w:uiPriority w:val="30"/>
-    <w:rsid w:val="00DC034F"/>
+    <w:rsid w:val="00FA73C7"/>
     <w:rPr>
       <w:i/>
       <w:iCs/>
-      <w:color w:val="2F5496" w:themeColor="accent1" w:themeShade="BF"/>
+      <w:color w:val="0F4761" w:themeColor="accent1" w:themeShade="BF"/>
     </w:rPr>
   </w:style>
   <w:style w:type="character" w:styleId="IntenseReference">
@@ -9245,12 +9196,12 @@
     <w:basedOn w:val="DefaultParagraphFont"/>
     <w:uiPriority w:val="32"/>
     <w:qFormat/>
-    <w:rsid w:val="00DC034F"/>
+    <w:rsid w:val="00FA73C7"/>
     <w:rPr>
       <w:b/>
       <w:bCs/>
       <w:smallCaps/>
-      <w:color w:val="2F5496" w:themeColor="accent1" w:themeShade="BF"/>
+      <w:color w:val="0F4761" w:themeColor="accent1" w:themeShade="BF"/>
       <w:spacing w:val="5"/>
     </w:rPr>
   </w:style>
@@ -9260,7 +9211,7 @@
     <w:uiPriority w:val="99"/>
     <w:semiHidden/>
     <w:unhideWhenUsed/>
-    <w:rsid w:val="00DC034F"/>
+    <w:rsid w:val="00FA73C7"/>
     <w:pPr>
       <w:spacing w:after="120" w:line="240" w:lineRule="auto"/>
     </w:pPr>
@@ -9274,7 +9225,7 @@
   <w:style w:type="paragraph" w:customStyle="1" w:styleId="lead">
     <w:name w:val="lead"/>
     <w:basedOn w:val="Normal"/>
-    <w:rsid w:val="00DC034F"/>
+    <w:rsid w:val="00FA73C7"/>
     <w:pPr>
       <w:spacing w:after="60" w:line="240" w:lineRule="auto"/>
     </w:pPr>
@@ -9291,7 +9242,7 @@
   <w:style w:type="paragraph" w:customStyle="1" w:styleId="small">
     <w:name w:val="small"/>
     <w:basedOn w:val="Normal"/>
-    <w:rsid w:val="00DC034F"/>
+    <w:rsid w:val="00FA73C7"/>
     <w:pPr>
       <w:spacing w:after="60" w:line="240" w:lineRule="auto"/>
     </w:pPr>
@@ -9308,7 +9259,7 @@
   <w:style w:type="character" w:customStyle="1" w:styleId="fill1">
     <w:name w:val="fill1"/>
     <w:basedOn w:val="DefaultParagraphFont"/>
-    <w:rsid w:val="00DC034F"/>
+    <w:rsid w:val="00FA73C7"/>
     <w:rPr>
       <w:shd w:val="clear" w:color="auto" w:fill="FEF3C7"/>
     </w:rPr>
@@ -9319,7 +9270,7 @@
     <w:link w:val="HeaderChar"/>
     <w:uiPriority w:val="99"/>
     <w:unhideWhenUsed/>
-    <w:rsid w:val="00DC034F"/>
+    <w:rsid w:val="00FA73C7"/>
     <w:pPr>
       <w:tabs>
         <w:tab w:val="center" w:pos="4513"/>
@@ -9333,7 +9284,7 @@
     <w:basedOn w:val="DefaultParagraphFont"/>
     <w:link w:val="Header"/>
     <w:uiPriority w:val="99"/>
-    <w:rsid w:val="00DC034F"/>
+    <w:rsid w:val="00FA73C7"/>
   </w:style>
   <w:style w:type="paragraph" w:styleId="Footer">
     <w:name w:val="footer"/>
@@ -9341,7 +9292,7 @@
     <w:link w:val="FooterChar"/>
     <w:uiPriority w:val="99"/>
     <w:unhideWhenUsed/>
-    <w:rsid w:val="00DC034F"/>
+    <w:rsid w:val="00FA73C7"/>
     <w:pPr>
       <w:tabs>
         <w:tab w:val="center" w:pos="4513"/>
@@ -9355,7 +9306,7 @@
     <w:basedOn w:val="DefaultParagraphFont"/>
     <w:link w:val="Footer"/>
     <w:uiPriority w:val="99"/>
-    <w:rsid w:val="00DC034F"/>
+    <w:rsid w:val="00FA73C7"/>
   </w:style>
 </w:styles>
 </file>
@@ -9371,39 +9322,39 @@
         <a:sysClr val="window" lastClr="FFFFFF"/>
       </a:lt1>
       <a:dk2>
-        <a:srgbClr val="44546A"/>
+        <a:srgbClr val="0E2841"/>
       </a:dk2>
       <a:lt2>
-        <a:srgbClr val="E7E6E6"/>
+        <a:srgbClr val="E8E8E8"/>
       </a:lt2>
       <a:accent1>
-        <a:srgbClr val="4472C4"/>
+        <a:srgbClr val="156082"/>
       </a:accent1>
       <a:accent2>
-        <a:srgbClr val="ED7D31"/>
+        <a:srgbClr val="E97132"/>
       </a:accent2>
       <a:accent3>
-        <a:srgbClr val="A5A5A5"/>
+        <a:srgbClr val="196B24"/>
       </a:accent3>
       <a:accent4>
-        <a:srgbClr val="FFC000"/>
+        <a:srgbClr val="0F9ED5"/>
       </a:accent4>
       <a:accent5>
-        <a:srgbClr val="5B9BD5"/>
+        <a:srgbClr val="A02B93"/>
       </a:accent5>
       <a:accent6>
-        <a:srgbClr val="70AD47"/>
+        <a:srgbClr val="4EA72E"/>
       </a:accent6>
       <a:hlink>
-        <a:srgbClr val="0563C1"/>
+        <a:srgbClr val="467886"/>
       </a:hlink>
       <a:folHlink>
-        <a:srgbClr val="954F72"/>
+        <a:srgbClr val="96607D"/>
       </a:folHlink>
     </a:clrScheme>
     <a:fontScheme name="Office">
       <a:majorFont>
-        <a:latin typeface="Calibri Light" panose="020F0302020204030204"/>
+        <a:latin typeface="Aptos Display" panose="02110004020202020204"/>
         <a:ea typeface=""/>
         <a:cs typeface=""/>
         <a:font script="Jpan" typeface="游ゴシック Light"/>
@@ -9455,7 +9406,7 @@
         <a:font script="Tfng" typeface="Ebrima"/>
       </a:majorFont>
       <a:minorFont>
-        <a:latin typeface="Calibri" panose="020F0502020204030204"/>
+        <a:latin typeface="Aptos" panose="02110004020202020204"/>
         <a:ea typeface=""/>
         <a:cs typeface=""/>
         <a:font script="Jpan" typeface="游明朝"/>
@@ -9566,13 +9517,6 @@
         </a:gradFill>
       </a:fillStyleLst>
       <a:lnStyleLst>
-        <a:ln w="6350" cap="flat" cmpd="sng" algn="ctr">
-          <a:solidFill>
-            <a:schemeClr val="phClr"/>
-          </a:solidFill>
-          <a:prstDash val="solid"/>
-          <a:miter lim="800000"/>
-        </a:ln>
         <a:ln w="12700" cap="flat" cmpd="sng" algn="ctr">
           <a:solidFill>
             <a:schemeClr val="phClr"/>
@@ -9581,6 +9525,13 @@
           <a:miter lim="800000"/>
         </a:ln>
         <a:ln w="19050" cap="flat" cmpd="sng" algn="ctr">
+          <a:solidFill>
+            <a:schemeClr val="phClr"/>
+          </a:solidFill>
+          <a:prstDash val="solid"/>
+          <a:miter lim="800000"/>
+        </a:ln>
+        <a:ln w="25400" cap="flat" cmpd="sng" algn="ctr">
           <a:solidFill>
             <a:schemeClr val="phClr"/>
           </a:solidFill>
@@ -9645,11 +9596,31 @@
       </a:bgFillStyleLst>
     </a:fmtScheme>
   </a:themeElements>
-  <a:objectDefaults/>
+  <a:objectDefaults>
+    <a:lnDef>
+      <a:spPr/>
+      <a:bodyPr/>
+      <a:lstStyle/>
+      <a:style>
+        <a:lnRef idx="2">
+          <a:schemeClr val="accent1"/>
+        </a:lnRef>
+        <a:fillRef idx="0">
+          <a:schemeClr val="accent1"/>
+        </a:fillRef>
+        <a:effectRef idx="1">
+          <a:schemeClr val="accent1"/>
+        </a:effectRef>
+        <a:fontRef idx="minor">
+          <a:schemeClr val="tx1"/>
+        </a:fontRef>
+      </a:style>
+    </a:lnDef>
+  </a:objectDefaults>
   <a:extraClrSchemeLst/>
   <a:extLst>
     <a:ext uri="{05A4C25C-085E-4340-85A3-A5531E510DB2}">
-      <thm15:themeFamily xmlns:thm15="http://schemas.microsoft.com/office/thememl/2012/main" name="Office Theme" id="{62F939B6-93AF-4DB8-9C6B-D6C7DFDC589F}" vid="{4A3C46E8-61CC-4603-A589-7422A47A8E4A}"/>
+      <thm15:themeFamily xmlns:thm15="http://schemas.microsoft.com/office/thememl/2012/main" name="Office Theme" id="{2E142A2C-CD16-42D6-873A-C26D2A0506FA}" vid="{1BDDFF52-6CD6-40A5-AB3C-68EB2F1E4D0A}"/>
     </a:ext>
   </a:extLst>
 </a:theme>

</xml_diff>